<commit_message>
docs: update documentation for Sprint 4 - Hito 2
</commit_message>
<xml_diff>
--- a/01_Documentacion/LOG/LOG-001_Bitacora_Tecnica_0.1.docx
+++ b/01_Documentacion/LOG/LOG-001_Bitacora_Tecnica_0.1.docx
@@ -123,7 +123,7 @@
     <w:p>
       <w:r>
         <w:pict w14:anchorId="1C84C7BF">
-          <v:rect id="_x0000_i1123" style="width:0;height:1.5pt" o:hrstd="t" o:hr="t" fillcolor="#a0a0a0" stroked="f"/>
+          <v:rect id="_x0000_i1025" style="width:0;height:1.5pt" o:hrstd="t" o:hr="t" fillcolor="#a0a0a0" stroked="f"/>
         </w:pict>
       </w:r>
     </w:p>
@@ -187,7 +187,7 @@
     <w:p>
       <w:r>
         <w:pict w14:anchorId="2CEF9F10">
-          <v:rect id="_x0000_i1124" style="width:0;height:1.5pt" o:hrstd="t" o:hr="t" fillcolor="#a0a0a0" stroked="f"/>
+          <v:rect id="_x0000_i1026" style="width:0;height:1.5pt" o:hrstd="t" o:hr="t" fillcolor="#a0a0a0" stroked="f"/>
         </w:pict>
       </w:r>
     </w:p>
@@ -428,7 +428,7 @@
     <w:p>
       <w:r>
         <w:pict w14:anchorId="7FB5F6E2">
-          <v:rect id="_x0000_i1125" style="width:0;height:1.5pt" o:hrstd="t" o:hr="t" fillcolor="#a0a0a0" stroked="f"/>
+          <v:rect id="_x0000_i1027" style="width:0;height:1.5pt" o:hrstd="t" o:hr="t" fillcolor="#a0a0a0" stroked="f"/>
         </w:pict>
       </w:r>
     </w:p>
@@ -753,7 +753,7 @@
     <w:p>
       <w:r>
         <w:pict w14:anchorId="02CD46A6">
-          <v:rect id="_x0000_i1126" style="width:0;height:1.5pt" o:hrstd="t" o:hr="t" fillcolor="#a0a0a0" stroked="f"/>
+          <v:rect id="_x0000_i1028" style="width:0;height:1.5pt" o:hrstd="t" o:hr="t" fillcolor="#a0a0a0" stroked="f"/>
         </w:pict>
       </w:r>
     </w:p>
@@ -784,7 +784,7 @@
     <w:p>
       <w:r>
         <w:pict w14:anchorId="181BFC3D">
-          <v:rect id="_x0000_i1127" style="width:0;height:1.5pt" o:hrstd="t" o:hr="t" fillcolor="#a0a0a0" stroked="f"/>
+          <v:rect id="_x0000_i1029" style="width:0;height:1.5pt" o:hrstd="t" o:hr="t" fillcolor="#a0a0a0" stroked="f"/>
         </w:pict>
       </w:r>
     </w:p>
@@ -968,7 +968,7 @@
     <w:p>
       <w:r>
         <w:pict w14:anchorId="04A870E8">
-          <v:rect id="_x0000_i1128" style="width:0;height:1.5pt" o:hrstd="t" o:hr="t" fillcolor="#a0a0a0" stroked="f"/>
+          <v:rect id="_x0000_i1030" style="width:0;height:1.5pt" o:hrstd="t" o:hr="t" fillcolor="#a0a0a0" stroked="f"/>
         </w:pict>
       </w:r>
     </w:p>
@@ -1130,7 +1130,7 @@
     <w:p>
       <w:r>
         <w:pict w14:anchorId="4D001600">
-          <v:rect id="_x0000_i1129" style="width:0;height:1.5pt" o:hrstd="t" o:hr="t" fillcolor="#a0a0a0" stroked="f"/>
+          <v:rect id="_x0000_i1031" style="width:0;height:1.5pt" o:hrstd="t" o:hr="t" fillcolor="#a0a0a0" stroked="f"/>
         </w:pict>
       </w:r>
     </w:p>
@@ -1291,7 +1291,7 @@
     <w:p>
       <w:r>
         <w:pict w14:anchorId="1758CDCD">
-          <v:rect id="_x0000_i1130" style="width:0;height:1.5pt" o:hrstd="t" o:hr="t" fillcolor="#a0a0a0" stroked="f"/>
+          <v:rect id="_x0000_i1032" style="width:0;height:1.5pt" o:hrstd="t" o:hr="t" fillcolor="#a0a0a0" stroked="f"/>
         </w:pict>
       </w:r>
     </w:p>
@@ -1591,7 +1591,7 @@
     <w:p>
       <w:r>
         <w:pict w14:anchorId="44DBF61B">
-          <v:rect id="_x0000_i1131" style="width:0;height:1.5pt" o:hrstd="t" o:hr="t" fillcolor="#a0a0a0" stroked="f"/>
+          <v:rect id="_x0000_i1033" style="width:0;height:1.5pt" o:hrstd="t" o:hr="t" fillcolor="#a0a0a0" stroked="f"/>
         </w:pict>
       </w:r>
     </w:p>
@@ -1884,7 +1884,7 @@
     <w:p>
       <w:r>
         <w:pict w14:anchorId="457D5255">
-          <v:rect id="_x0000_i1132" style="width:0;height:1.5pt" o:hrstd="t" o:hr="t" fillcolor="#a0a0a0" stroked="f"/>
+          <v:rect id="_x0000_i1034" style="width:0;height:1.5pt" o:hrstd="t" o:hr="t" fillcolor="#a0a0a0" stroked="f"/>
         </w:pict>
       </w:r>
     </w:p>
@@ -1908,68 +1908,1098 @@
     <w:p>
       <w:pPr>
         <w:rPr>
-          <w:lang w:val="es-PE"/>
-        </w:rPr>
-      </w:pPr>
-      <w:r>
-        <w:rPr>
-          <w:b/>
-          <w:bCs/>
-          <w:lang w:val="es-PE"/>
-        </w:rPr>
-        <w:t>Estado</w:t>
-      </w:r>
-    </w:p>
-    <w:p>
-      <w:pPr>
-        <w:rPr>
-          <w:lang w:val="es-PE"/>
-        </w:rPr>
-      </w:pPr>
-      <w:r>
-        <w:rPr>
-          <w:lang w:val="es-PE"/>
+          <w:b/>
+          <w:bCs/>
+          <w:lang w:val="es-PE"/>
+        </w:rPr>
+      </w:pPr>
+      <w:r>
+        <w:rPr>
+          <w:b/>
+          <w:bCs/>
+          <w:lang w:val="es-PE"/>
+        </w:rPr>
+        <w:t>## Sprint 4 – Hito 2</w:t>
+      </w:r>
+    </w:p>
+    <w:p>
+      <w:pPr>
+        <w:rPr>
+          <w:b/>
+          <w:bCs/>
+          <w:lang w:val="es-PE"/>
+        </w:rPr>
+      </w:pPr>
+    </w:p>
+    <w:p>
+      <w:pPr>
+        <w:rPr>
+          <w:b/>
+          <w:bCs/>
+          <w:lang w:val="es-PE"/>
+        </w:rPr>
+      </w:pPr>
+      <w:r>
+        <w:rPr>
+          <w:b/>
+          <w:bCs/>
+          <w:lang w:val="es-PE"/>
+        </w:rPr>
+        <w:t>## 2026-07-01 -- Cierre del Hito 2</w:t>
+      </w:r>
+    </w:p>
+    <w:p>
+      <w:pPr>
+        <w:rPr>
+          <w:b/>
+          <w:bCs/>
+          <w:lang w:val="es-PE"/>
+        </w:rPr>
+      </w:pPr>
+    </w:p>
+    <w:p>
+      <w:pPr>
+        <w:rPr>
+          <w:b/>
+          <w:bCs/>
+          <w:lang w:val="es-PE"/>
+        </w:rPr>
+      </w:pPr>
+      <w:r>
+        <w:rPr>
+          <w:b/>
+          <w:bCs/>
+          <w:lang w:val="es-PE"/>
+        </w:rPr>
+        <w:t>### Módulo</w:t>
+      </w:r>
+    </w:p>
+    <w:p>
+      <w:pPr>
+        <w:rPr>
+          <w:b/>
+          <w:bCs/>
+          <w:lang w:val="es-PE"/>
+        </w:rPr>
+      </w:pPr>
+      <w:r>
+        <w:rPr>
+          <w:b/>
+          <w:bCs/>
+          <w:lang w:val="es-PE"/>
+        </w:rPr>
+        <w:t>Text Splitter</w:t>
+      </w:r>
+    </w:p>
+    <w:p>
+      <w:pPr>
+        <w:rPr>
+          <w:b/>
+          <w:bCs/>
+          <w:lang w:val="es-PE"/>
+        </w:rPr>
+      </w:pPr>
+    </w:p>
+    <w:p>
+      <w:pPr>
+        <w:rPr>
+          <w:b/>
+          <w:bCs/>
+          <w:lang w:val="es-PE"/>
+        </w:rPr>
+      </w:pPr>
+      <w:r>
+        <w:rPr>
+          <w:b/>
+          <w:bCs/>
+          <w:lang w:val="es-PE"/>
+        </w:rPr>
+        <w:t>### Estado</w:t>
+      </w:r>
+    </w:p>
+    <w:p>
+      <w:pPr>
+        <w:rPr>
+          <w:b/>
+          <w:bCs/>
+          <w:lang w:val="es-PE"/>
+        </w:rPr>
+      </w:pPr>
+      <w:r>
+        <w:rPr>
+          <w:b/>
+          <w:bCs/>
+          <w:lang w:val="es-PE"/>
+        </w:rPr>
+        <w:t>Finalizado</w:t>
+      </w:r>
+    </w:p>
+    <w:p>
+      <w:pPr>
+        <w:rPr>
+          <w:b/>
+          <w:bCs/>
+          <w:lang w:val="es-PE"/>
+        </w:rPr>
+      </w:pPr>
+    </w:p>
+    <w:p>
+      <w:pPr>
+        <w:rPr>
+          <w:b/>
+          <w:bCs/>
+          <w:lang w:val="es-PE"/>
+        </w:rPr>
+      </w:pPr>
+      <w:r>
+        <w:rPr>
+          <w:b/>
+          <w:bCs/>
+          <w:lang w:val="es-PE"/>
+        </w:rPr>
+        <w:t>### Actividades realizadas</w:t>
+      </w:r>
+    </w:p>
+    <w:p>
+      <w:pPr>
+        <w:rPr>
+          <w:b/>
+          <w:bCs/>
+          <w:lang w:val="es-PE"/>
+        </w:rPr>
+      </w:pPr>
+    </w:p>
+    <w:p>
+      <w:pPr>
+        <w:rPr>
+          <w:b/>
+          <w:bCs/>
+          <w:lang w:val="es-PE"/>
+        </w:rPr>
+      </w:pPr>
+      <w:r>
+        <w:rPr>
+          <w:b/>
+          <w:bCs/>
+          <w:lang w:val="es-PE"/>
+        </w:rPr>
+        <w:t>- Implementación de la clase `</w:t>
+      </w:r>
+      <w:proofErr w:type="spellStart"/>
+      <w:r>
+        <w:rPr>
+          <w:b/>
+          <w:bCs/>
+          <w:lang w:val="es-PE"/>
+        </w:rPr>
+        <w:t>TextSplitter</w:t>
+      </w:r>
+      <w:proofErr w:type="spellEnd"/>
+      <w:r>
+        <w:rPr>
+          <w:b/>
+          <w:bCs/>
+          <w:lang w:val="es-PE"/>
+        </w:rPr>
+        <w:t>`.</w:t>
+      </w:r>
+    </w:p>
+    <w:p>
+      <w:pPr>
+        <w:rPr>
+          <w:b/>
+          <w:bCs/>
+          <w:lang w:val="es-PE"/>
+        </w:rPr>
+      </w:pPr>
+      <w:r>
+        <w:rPr>
+          <w:b/>
+          <w:bCs/>
+          <w:lang w:val="es-PE"/>
+        </w:rPr>
+        <w:t>- Integración de `</w:t>
+      </w:r>
+      <w:proofErr w:type="spellStart"/>
+      <w:r>
+        <w:rPr>
+          <w:b/>
+          <w:bCs/>
+          <w:lang w:val="es-PE"/>
+        </w:rPr>
+        <w:t>RecursiveCharacterTextSplitter</w:t>
+      </w:r>
+      <w:proofErr w:type="spellEnd"/>
+      <w:r>
+        <w:rPr>
+          <w:b/>
+          <w:bCs/>
+          <w:lang w:val="es-PE"/>
+        </w:rPr>
+        <w:t>`.</w:t>
+      </w:r>
+    </w:p>
+    <w:p>
+      <w:pPr>
+        <w:rPr>
+          <w:b/>
+          <w:bCs/>
+          <w:lang w:val="es-PE"/>
+        </w:rPr>
+      </w:pPr>
+      <w:r>
+        <w:rPr>
+          <w:b/>
+          <w:bCs/>
+          <w:lang w:val="es-PE"/>
+        </w:rPr>
+        <w:t>- Lectura de configuración desde `settings.py`.</w:t>
+      </w:r>
+    </w:p>
+    <w:p>
+      <w:pPr>
+        <w:rPr>
+          <w:b/>
+          <w:bCs/>
+          <w:lang w:val="es-PE"/>
+        </w:rPr>
+      </w:pPr>
+      <w:r>
+        <w:rPr>
+          <w:b/>
+          <w:bCs/>
+          <w:lang w:val="es-PE"/>
+        </w:rPr>
+        <w:t>- Implementación de validación de documentos de entrada.</w:t>
+      </w:r>
+    </w:p>
+    <w:p>
+      <w:pPr>
+        <w:rPr>
+          <w:b/>
+          <w:bCs/>
+          <w:lang w:val="es-PE"/>
+        </w:rPr>
+      </w:pPr>
+      <w:r>
+        <w:rPr>
+          <w:b/>
+          <w:bCs/>
+          <w:lang w:val="es-PE"/>
+        </w:rPr>
+        <w:t>- Implementación de la fragmentación de documentos.</w:t>
+      </w:r>
+    </w:p>
+    <w:p>
+      <w:pPr>
+        <w:rPr>
+          <w:b/>
+          <w:bCs/>
+          <w:lang w:val="es-PE"/>
+        </w:rPr>
+      </w:pPr>
+      <w:r>
+        <w:rPr>
+          <w:b/>
+          <w:bCs/>
+          <w:lang w:val="es-PE"/>
+        </w:rPr>
+        <w:t xml:space="preserve">- Implementación del enriquecimiento de </w:t>
+      </w:r>
+      <w:proofErr w:type="spellStart"/>
+      <w:r>
+        <w:rPr>
+          <w:b/>
+          <w:bCs/>
+          <w:lang w:val="es-PE"/>
+        </w:rPr>
+        <w:t>metadata</w:t>
+      </w:r>
+      <w:proofErr w:type="spellEnd"/>
+      <w:r>
+        <w:rPr>
+          <w:b/>
+          <w:bCs/>
+          <w:lang w:val="es-PE"/>
+        </w:rPr>
+        <w:t xml:space="preserve"> de los </w:t>
+      </w:r>
+      <w:proofErr w:type="spellStart"/>
+      <w:r>
+        <w:rPr>
+          <w:b/>
+          <w:bCs/>
+          <w:lang w:val="es-PE"/>
+        </w:rPr>
+        <w:t>chunks</w:t>
+      </w:r>
+      <w:proofErr w:type="spellEnd"/>
+      <w:r>
+        <w:rPr>
+          <w:b/>
+          <w:bCs/>
+          <w:lang w:val="es-PE"/>
+        </w:rPr>
+        <w:t>.</w:t>
+      </w:r>
+    </w:p>
+    <w:p>
+      <w:pPr>
+        <w:rPr>
+          <w:b/>
+          <w:bCs/>
+          <w:lang w:val="es-PE"/>
+        </w:rPr>
+      </w:pPr>
+      <w:r>
+        <w:rPr>
+          <w:b/>
+          <w:bCs/>
+          <w:lang w:val="es-PE"/>
+        </w:rPr>
+        <w:t>- Integración con el módulo `</w:t>
+      </w:r>
+      <w:proofErr w:type="spellStart"/>
+      <w:r>
+        <w:rPr>
+          <w:b/>
+          <w:bCs/>
+          <w:lang w:val="es-PE"/>
+        </w:rPr>
+        <w:t>DocumentLoader</w:t>
+      </w:r>
+      <w:proofErr w:type="spellEnd"/>
+      <w:r>
+        <w:rPr>
+          <w:b/>
+          <w:bCs/>
+          <w:lang w:val="es-PE"/>
+        </w:rPr>
+        <w:t>`.</w:t>
+      </w:r>
+    </w:p>
+    <w:p>
+      <w:pPr>
+        <w:rPr>
+          <w:b/>
+          <w:bCs/>
+          <w:lang w:val="es-PE"/>
+        </w:rPr>
+      </w:pPr>
+      <w:r>
+        <w:rPr>
+          <w:b/>
+          <w:bCs/>
+          <w:lang w:val="es-PE"/>
+        </w:rPr>
+        <w:t>- Validación mediante pruebas unitarias y de integración.</w:t>
+      </w:r>
+    </w:p>
+    <w:p>
+      <w:pPr>
+        <w:rPr>
+          <w:b/>
+          <w:bCs/>
+          <w:lang w:val="es-PE"/>
+        </w:rPr>
+      </w:pPr>
+    </w:p>
+    <w:p>
+      <w:pPr>
+        <w:rPr>
+          <w:b/>
+          <w:bCs/>
+          <w:lang w:val="es-PE"/>
+        </w:rPr>
+      </w:pPr>
+      <w:r>
+        <w:rPr>
+          <w:b/>
+          <w:bCs/>
+          <w:lang w:val="es-PE"/>
+        </w:rPr>
+        <w:t>### Resultados</w:t>
+      </w:r>
+    </w:p>
+    <w:p>
+      <w:pPr>
+        <w:rPr>
+          <w:b/>
+          <w:bCs/>
+          <w:lang w:val="es-PE"/>
+        </w:rPr>
+      </w:pPr>
+    </w:p>
+    <w:p>
+      <w:pPr>
+        <w:rPr>
+          <w:b/>
+          <w:bCs/>
+          <w:lang w:val="es-PE"/>
+        </w:rPr>
+      </w:pPr>
+      <w:r>
+        <w:rPr>
+          <w:b/>
+          <w:bCs/>
+          <w:lang w:val="es-PE"/>
+        </w:rPr>
+        <w:t>- Fragmentación correcta de documentos.</w:t>
+      </w:r>
+    </w:p>
+    <w:p>
+      <w:pPr>
+        <w:rPr>
+          <w:b/>
+          <w:bCs/>
+          <w:lang w:val="es-PE"/>
+        </w:rPr>
+      </w:pPr>
+      <w:r>
+        <w:rPr>
+          <w:b/>
+          <w:bCs/>
+          <w:lang w:val="es-PE"/>
+        </w:rPr>
+        <w:t xml:space="preserve">- Conservación de </w:t>
+      </w:r>
+      <w:proofErr w:type="spellStart"/>
+      <w:r>
+        <w:rPr>
+          <w:b/>
+          <w:bCs/>
+          <w:lang w:val="es-PE"/>
+        </w:rPr>
+        <w:t>metadata</w:t>
+      </w:r>
+      <w:proofErr w:type="spellEnd"/>
+      <w:r>
+        <w:rPr>
+          <w:b/>
+          <w:bCs/>
+          <w:lang w:val="es-PE"/>
+        </w:rPr>
+        <w:t xml:space="preserve"> original.</w:t>
+      </w:r>
+    </w:p>
+    <w:p>
+      <w:pPr>
+        <w:rPr>
+          <w:b/>
+          <w:bCs/>
+          <w:lang w:val="es-PE"/>
+        </w:rPr>
+      </w:pPr>
+      <w:r>
+        <w:rPr>
+          <w:b/>
+          <w:bCs/>
+          <w:lang w:val="es-PE"/>
+        </w:rPr>
+        <w:t xml:space="preserve">- Incorporación de </w:t>
+      </w:r>
+      <w:proofErr w:type="spellStart"/>
+      <w:r>
+        <w:rPr>
+          <w:b/>
+          <w:bCs/>
+          <w:lang w:val="es-PE"/>
+        </w:rPr>
+        <w:t>metadata</w:t>
+      </w:r>
+      <w:proofErr w:type="spellEnd"/>
+      <w:r>
+        <w:rPr>
+          <w:b/>
+          <w:bCs/>
+          <w:lang w:val="es-PE"/>
+        </w:rPr>
+        <w:t xml:space="preserve"> enriquecida:</w:t>
+      </w:r>
+    </w:p>
+    <w:p>
+      <w:pPr>
+        <w:rPr>
+          <w:b/>
+          <w:bCs/>
+        </w:rPr>
+      </w:pPr>
+      <w:r>
+        <w:rPr>
+          <w:b/>
+          <w:bCs/>
+          <w:lang w:val="es-PE"/>
+        </w:rPr>
+        <w:t xml:space="preserve">  </w:t>
+      </w:r>
+      <w:r>
+        <w:rPr>
+          <w:b/>
+          <w:bCs/>
+        </w:rPr>
+        <w:t>- `</w:t>
+      </w:r>
+      <w:proofErr w:type="spellStart"/>
+      <w:r>
+        <w:rPr>
+          <w:b/>
+          <w:bCs/>
+        </w:rPr>
+        <w:t>chunk_index</w:t>
+      </w:r>
+      <w:proofErr w:type="spellEnd"/>
+      <w:r>
+        <w:rPr>
+          <w:b/>
+          <w:bCs/>
+        </w:rPr>
+        <w:t>`</w:t>
+      </w:r>
+    </w:p>
+    <w:p>
+      <w:pPr>
+        <w:rPr>
+          <w:b/>
+          <w:bCs/>
+        </w:rPr>
+      </w:pPr>
+      <w:r>
+        <w:rPr>
+          <w:b/>
+          <w:bCs/>
         </w:rPr>
         <w:lastRenderedPageBreak/>
-        <w:t>Pendiente de inicio.</w:t>
-      </w:r>
-    </w:p>
-    <w:p>
-      <w:proofErr w:type="spellStart"/>
-      <w:r>
-        <w:rPr>
-          <w:b/>
-          <w:bCs/>
-        </w:rPr>
-        <w:t>Próximo</w:t>
-      </w:r>
-      <w:proofErr w:type="spellEnd"/>
-      <w:r>
-        <w:rPr>
-          <w:b/>
-          <w:bCs/>
-        </w:rPr>
-        <w:t xml:space="preserve"> </w:t>
-      </w:r>
-      <w:proofErr w:type="spellStart"/>
-      <w:r>
-        <w:rPr>
-          <w:b/>
-          <w:bCs/>
-        </w:rPr>
-        <w:t>módulo</w:t>
-      </w:r>
-      <w:proofErr w:type="spellEnd"/>
-    </w:p>
-    <w:p>
-      <w:r>
-        <w:t>Text Splitter.</w:t>
+        <w:t>  - `</w:t>
+      </w:r>
+      <w:proofErr w:type="spellStart"/>
+      <w:r>
+        <w:rPr>
+          <w:b/>
+          <w:bCs/>
+        </w:rPr>
+        <w:t>total_chunks</w:t>
+      </w:r>
+      <w:proofErr w:type="spellEnd"/>
+      <w:r>
+        <w:rPr>
+          <w:b/>
+          <w:bCs/>
+        </w:rPr>
+        <w:t>`</w:t>
+      </w:r>
+    </w:p>
+    <w:p>
+      <w:pPr>
+        <w:rPr>
+          <w:b/>
+          <w:bCs/>
+        </w:rPr>
+      </w:pPr>
+      <w:r>
+        <w:rPr>
+          <w:b/>
+          <w:bCs/>
+        </w:rPr>
+        <w:t>  - `</w:t>
+      </w:r>
+      <w:proofErr w:type="spellStart"/>
+      <w:r>
+        <w:rPr>
+          <w:b/>
+          <w:bCs/>
+        </w:rPr>
+        <w:t>chunk_size</w:t>
+      </w:r>
+      <w:proofErr w:type="spellEnd"/>
+      <w:r>
+        <w:rPr>
+          <w:b/>
+          <w:bCs/>
+        </w:rPr>
+        <w:t>`</w:t>
+      </w:r>
+    </w:p>
+    <w:p>
+      <w:pPr>
+        <w:rPr>
+          <w:b/>
+          <w:bCs/>
+        </w:rPr>
+      </w:pPr>
+      <w:r>
+        <w:rPr>
+          <w:b/>
+          <w:bCs/>
+        </w:rPr>
+        <w:t>  - `</w:t>
+      </w:r>
+      <w:proofErr w:type="spellStart"/>
+      <w:r>
+        <w:rPr>
+          <w:b/>
+          <w:bCs/>
+        </w:rPr>
+        <w:t>splitter_version</w:t>
+      </w:r>
+      <w:proofErr w:type="spellEnd"/>
+      <w:r>
+        <w:rPr>
+          <w:b/>
+          <w:bCs/>
+        </w:rPr>
+        <w:t>`</w:t>
+      </w:r>
+    </w:p>
+    <w:p>
+      <w:pPr>
+        <w:rPr>
+          <w:b/>
+          <w:bCs/>
+          <w:lang w:val="es-PE"/>
+        </w:rPr>
+      </w:pPr>
+      <w:r>
+        <w:rPr>
+          <w:b/>
+          <w:bCs/>
+          <w:lang w:val="es-PE"/>
+        </w:rPr>
+        <w:t xml:space="preserve">- Generación correcta de </w:t>
+      </w:r>
+      <w:proofErr w:type="spellStart"/>
+      <w:r>
+        <w:rPr>
+          <w:b/>
+          <w:bCs/>
+          <w:lang w:val="es-PE"/>
+        </w:rPr>
+        <w:t>chunks</w:t>
+      </w:r>
+      <w:proofErr w:type="spellEnd"/>
+      <w:r>
+        <w:rPr>
+          <w:b/>
+          <w:bCs/>
+          <w:lang w:val="es-PE"/>
+        </w:rPr>
+        <w:t xml:space="preserve"> para documentos reales de la Knowledge Base.</w:t>
+      </w:r>
+    </w:p>
+    <w:p>
+      <w:pPr>
+        <w:rPr>
+          <w:b/>
+          <w:bCs/>
+          <w:lang w:val="es-PE"/>
+        </w:rPr>
+      </w:pPr>
+    </w:p>
+    <w:p>
+      <w:pPr>
+        <w:rPr>
+          <w:b/>
+          <w:bCs/>
+          <w:lang w:val="es-PE"/>
+        </w:rPr>
+      </w:pPr>
+      <w:r>
+        <w:rPr>
+          <w:b/>
+          <w:bCs/>
+          <w:lang w:val="es-PE"/>
+        </w:rPr>
+        <w:t>### Evidencias</w:t>
+      </w:r>
+    </w:p>
+    <w:p>
+      <w:pPr>
+        <w:rPr>
+          <w:b/>
+          <w:bCs/>
+          <w:lang w:val="es-PE"/>
+        </w:rPr>
+      </w:pPr>
+    </w:p>
+    <w:p>
+      <w:pPr>
+        <w:rPr>
+          <w:b/>
+          <w:bCs/>
+          <w:lang w:val="es-PE"/>
+        </w:rPr>
+      </w:pPr>
+      <w:r>
+        <w:rPr>
+          <w:b/>
+          <w:bCs/>
+          <w:lang w:val="es-PE"/>
+        </w:rPr>
+        <w:t xml:space="preserve">#### </w:t>
+      </w:r>
+      <w:proofErr w:type="spellStart"/>
+      <w:r>
+        <w:rPr>
+          <w:b/>
+          <w:bCs/>
+          <w:lang w:val="es-PE"/>
+        </w:rPr>
+        <w:t>check_text_splitter</w:t>
+      </w:r>
+      <w:proofErr w:type="spellEnd"/>
+    </w:p>
+    <w:p>
+      <w:pPr>
+        <w:rPr>
+          <w:b/>
+          <w:bCs/>
+          <w:lang w:val="es-PE"/>
+        </w:rPr>
+      </w:pPr>
+    </w:p>
+    <w:p>
+      <w:pPr>
+        <w:rPr>
+          <w:b/>
+          <w:bCs/>
+          <w:lang w:val="es-PE"/>
+        </w:rPr>
+      </w:pPr>
+      <w:r>
+        <w:rPr>
+          <w:b/>
+          <w:bCs/>
+          <w:lang w:val="es-PE"/>
+        </w:rPr>
+        <w:t>- Validación de inicialización.</w:t>
+      </w:r>
+    </w:p>
+    <w:p>
+      <w:pPr>
+        <w:rPr>
+          <w:b/>
+          <w:bCs/>
+          <w:lang w:val="es-PE"/>
+        </w:rPr>
+      </w:pPr>
+      <w:r>
+        <w:rPr>
+          <w:b/>
+          <w:bCs/>
+          <w:lang w:val="es-PE"/>
+        </w:rPr>
+        <w:t>- Validación de errores.</w:t>
+      </w:r>
+    </w:p>
+    <w:p>
+      <w:pPr>
+        <w:rPr>
+          <w:b/>
+          <w:bCs/>
+          <w:lang w:val="es-PE"/>
+        </w:rPr>
+      </w:pPr>
+      <w:r>
+        <w:rPr>
+          <w:b/>
+          <w:bCs/>
+          <w:lang w:val="es-PE"/>
+        </w:rPr>
+        <w:t>- Documento corto.</w:t>
+      </w:r>
+    </w:p>
+    <w:p>
+      <w:pPr>
+        <w:rPr>
+          <w:b/>
+          <w:bCs/>
+          <w:lang w:val="es-PE"/>
+        </w:rPr>
+      </w:pPr>
+      <w:r>
+        <w:rPr>
+          <w:b/>
+          <w:bCs/>
+          <w:lang w:val="es-PE"/>
+        </w:rPr>
+        <w:t>- Documento largo.</w:t>
+      </w:r>
+    </w:p>
+    <w:p>
+      <w:pPr>
+        <w:rPr>
+          <w:b/>
+          <w:bCs/>
+          <w:lang w:val="es-PE"/>
+        </w:rPr>
+      </w:pPr>
+      <w:r>
+        <w:rPr>
+          <w:b/>
+          <w:bCs/>
+          <w:lang w:val="es-PE"/>
+        </w:rPr>
+        <w:t xml:space="preserve">- </w:t>
+      </w:r>
+      <w:proofErr w:type="spellStart"/>
+      <w:r>
+        <w:rPr>
+          <w:b/>
+          <w:bCs/>
+          <w:lang w:val="es-PE"/>
+        </w:rPr>
+        <w:t>Metadata</w:t>
+      </w:r>
+      <w:proofErr w:type="spellEnd"/>
+      <w:r>
+        <w:rPr>
+          <w:b/>
+          <w:bCs/>
+          <w:lang w:val="es-PE"/>
+        </w:rPr>
+        <w:t xml:space="preserve"> enriquecida.</w:t>
+      </w:r>
+    </w:p>
+    <w:p>
+      <w:pPr>
+        <w:rPr>
+          <w:b/>
+          <w:bCs/>
+          <w:lang w:val="es-PE"/>
+        </w:rPr>
+      </w:pPr>
+    </w:p>
+    <w:p>
+      <w:pPr>
+        <w:rPr>
+          <w:b/>
+          <w:bCs/>
+          <w:lang w:val="es-PE"/>
+        </w:rPr>
+      </w:pPr>
+      <w:r>
+        <w:rPr>
+          <w:b/>
+          <w:bCs/>
+          <w:lang w:val="es-PE"/>
+        </w:rPr>
+        <w:t xml:space="preserve">#### </w:t>
+      </w:r>
+      <w:proofErr w:type="spellStart"/>
+      <w:r>
+        <w:rPr>
+          <w:b/>
+          <w:bCs/>
+          <w:lang w:val="es-PE"/>
+        </w:rPr>
+        <w:t>check_loader_splitter</w:t>
+      </w:r>
+      <w:proofErr w:type="spellEnd"/>
+    </w:p>
+    <w:p>
+      <w:pPr>
+        <w:rPr>
+          <w:b/>
+          <w:bCs/>
+          <w:lang w:val="es-PE"/>
+        </w:rPr>
+      </w:pPr>
+    </w:p>
+    <w:p>
+      <w:pPr>
+        <w:rPr>
+          <w:b/>
+          <w:bCs/>
+          <w:lang w:val="es-PE"/>
+        </w:rPr>
+      </w:pPr>
+      <w:r>
+        <w:rPr>
+          <w:b/>
+          <w:bCs/>
+          <w:lang w:val="es-PE"/>
+        </w:rPr>
+        <w:t xml:space="preserve">- Integración </w:t>
+      </w:r>
+      <w:proofErr w:type="spellStart"/>
+      <w:r>
+        <w:rPr>
+          <w:b/>
+          <w:bCs/>
+          <w:lang w:val="es-PE"/>
+        </w:rPr>
+        <w:t>Document</w:t>
+      </w:r>
+      <w:proofErr w:type="spellEnd"/>
+      <w:r>
+        <w:rPr>
+          <w:b/>
+          <w:bCs/>
+          <w:lang w:val="es-PE"/>
+        </w:rPr>
+        <w:t xml:space="preserve"> Loader → Text Splitter.</w:t>
+      </w:r>
+    </w:p>
+    <w:p>
+      <w:pPr>
+        <w:rPr>
+          <w:b/>
+          <w:bCs/>
+          <w:lang w:val="es-PE"/>
+        </w:rPr>
+      </w:pPr>
+      <w:r>
+        <w:rPr>
+          <w:b/>
+          <w:bCs/>
+          <w:lang w:val="es-PE"/>
+        </w:rPr>
+        <w:t xml:space="preserve">- 4 </w:t>
+      </w:r>
+      <w:proofErr w:type="spellStart"/>
+      <w:r>
+        <w:rPr>
+          <w:b/>
+          <w:bCs/>
+          <w:lang w:val="es-PE"/>
+        </w:rPr>
+        <w:t>PDFs</w:t>
+      </w:r>
+      <w:proofErr w:type="spellEnd"/>
+      <w:r>
+        <w:rPr>
+          <w:b/>
+          <w:bCs/>
+          <w:lang w:val="es-PE"/>
+        </w:rPr>
+        <w:t xml:space="preserve"> procesados.</w:t>
+      </w:r>
+    </w:p>
+    <w:p>
+      <w:pPr>
+        <w:rPr>
+          <w:b/>
+          <w:bCs/>
+          <w:lang w:val="es-PE"/>
+        </w:rPr>
+      </w:pPr>
+      <w:r>
+        <w:rPr>
+          <w:b/>
+          <w:bCs/>
+          <w:lang w:val="es-PE"/>
+        </w:rPr>
+        <w:t>- 124 documentos cargados.</w:t>
+      </w:r>
+    </w:p>
+    <w:p>
+      <w:pPr>
+        <w:rPr>
+          <w:b/>
+          <w:bCs/>
+          <w:lang w:val="es-PE"/>
+        </w:rPr>
+      </w:pPr>
+      <w:r>
+        <w:rPr>
+          <w:b/>
+          <w:bCs/>
+          <w:lang w:val="es-PE"/>
+        </w:rPr>
+        <w:t xml:space="preserve">- 367 </w:t>
+      </w:r>
+      <w:proofErr w:type="spellStart"/>
+      <w:r>
+        <w:rPr>
+          <w:b/>
+          <w:bCs/>
+          <w:lang w:val="es-PE"/>
+        </w:rPr>
+        <w:t>chunks</w:t>
+      </w:r>
+      <w:proofErr w:type="spellEnd"/>
+      <w:r>
+        <w:rPr>
+          <w:b/>
+          <w:bCs/>
+          <w:lang w:val="es-PE"/>
+        </w:rPr>
+        <w:t xml:space="preserve"> generados.</w:t>
+      </w:r>
+    </w:p>
+    <w:p>
+      <w:pPr>
+        <w:rPr>
+          <w:b/>
+          <w:bCs/>
+          <w:lang w:val="es-PE"/>
+        </w:rPr>
+      </w:pPr>
+      <w:r>
+        <w:rPr>
+          <w:b/>
+          <w:bCs/>
+          <w:lang w:val="es-PE"/>
+        </w:rPr>
+        <w:t>- 0 errores.</w:t>
+      </w:r>
+    </w:p>
+    <w:p>
+      <w:pPr>
+        <w:rPr>
+          <w:b/>
+          <w:bCs/>
+          <w:lang w:val="es-PE"/>
+        </w:rPr>
+      </w:pPr>
+    </w:p>
+    <w:p>
+      <w:pPr>
+        <w:rPr>
+          <w:b/>
+          <w:bCs/>
+          <w:lang w:val="es-PE"/>
+        </w:rPr>
+      </w:pPr>
+      <w:r>
+        <w:rPr>
+          <w:b/>
+          <w:bCs/>
+          <w:lang w:val="es-PE"/>
+        </w:rPr>
+        <w:t>### Estado final</w:t>
+      </w:r>
+    </w:p>
+    <w:p>
+      <w:pPr>
+        <w:rPr>
+          <w:b/>
+          <w:bCs/>
+          <w:lang w:val="es-PE"/>
+        </w:rPr>
+      </w:pPr>
+    </w:p>
+    <w:p>
+      <w:pPr>
+        <w:rPr>
+          <w:b/>
+          <w:bCs/>
+          <w:lang w:val="es-PE"/>
+        </w:rPr>
+      </w:pPr>
+      <w:r>
+        <w:rPr>
+          <w:b/>
+          <w:bCs/>
+          <w:lang w:val="es-PE"/>
+        </w:rPr>
+        <w:lastRenderedPageBreak/>
+        <w:t>Sprint 4 – Hito 2 listo para documentación final, control de versiones y preparación de la Release v0.2.0.</w:t>
       </w:r>
     </w:p>
     <w:p>
       <w:r>
         <w:pict w14:anchorId="73CC6FA0">
-          <v:rect id="_x0000_i1133" style="width:0;height:1.5pt" o:hrstd="t" o:hr="t" fillcolor="#a0a0a0" stroked="f"/>
+          <v:rect id="_x0000_i1035" style="width:0;height:1.5pt" o:hrstd="t" o:hr="t" fillcolor="#a0a0a0" stroked="f"/>
         </w:pict>
       </w:r>
     </w:p>
@@ -2253,7 +3283,7 @@
     <w:p>
       <w:r>
         <w:pict w14:anchorId="04E34AC9">
-          <v:rect id="_x0000_i1134" style="width:0;height:1.5pt" o:hrstd="t" o:hr="t" fillcolor="#a0a0a0" stroked="f"/>
+          <v:rect id="_x0000_i1036" style="width:0;height:1.5pt" o:hrstd="t" o:hr="t" fillcolor="#a0a0a0" stroked="f"/>
         </w:pict>
       </w:r>
     </w:p>
@@ -2389,7 +3419,7 @@
     <w:p>
       <w:r>
         <w:pict w14:anchorId="1EB8A5A9">
-          <v:rect id="_x0000_i1135" style="width:0;height:1.5pt" o:hrstd="t" o:hr="t" fillcolor="#a0a0a0" stroked="f"/>
+          <v:rect id="_x0000_i1037" style="width:0;height:1.5pt" o:hrstd="t" o:hr="t" fillcolor="#a0a0a0" stroked="f"/>
         </w:pict>
       </w:r>
     </w:p>
@@ -2481,7 +3511,6 @@
         <w:rPr>
           <w:lang w:val="es-PE"/>
         </w:rPr>
-        <w:lastRenderedPageBreak/>
         <w:t xml:space="preserve">cuando se produzca una decisión arquitectónica significativa; </w:t>
       </w:r>
     </w:p>
@@ -2504,8 +3533,9 @@
     </w:p>
     <w:p>
       <w:r>
+        <w:lastRenderedPageBreak/>
         <w:pict w14:anchorId="2CB8176B">
-          <v:rect id="_x0000_i1136" style="width:0;height:1.5pt" o:hrstd="t" o:hr="t" fillcolor="#a0a0a0" stroked="f"/>
+          <v:rect id="_x0000_i1038" style="width:0;height:1.5pt" o:hrstd="t" o:hr="t" fillcolor="#a0a0a0" stroked="f"/>
         </w:pict>
       </w:r>
     </w:p>

</xml_diff>